<commit_message>
Manual: add 标记已评论, multi-keyword FAQ, account-not-found fix note
</commit_message>
<xml_diff>
--- a/docs/x-console-manual/X浏览控制台-运营操作手册.docx
+++ b/docs/x-console-manual/X浏览控制台-运营操作手册.docx
@@ -1624,6 +1624,36 @@
           <w:p>
             <w:r/>
             <w:r>
+              <w:t>标记已评论</w:t>
+            </w:r>
+          </w:p>
+        </w:tc>
+        <w:tc>
+          <w:tcPr>
+            <w:tcW w:type="dxa" w:w="4320"/>
+          </w:tcPr>
+          <w:p>
+            <w:r/>
+            <w:r>
+              <w:t>手动回复完成后点这个 → 该条标记为已发布，并</w:t>
+            </w:r>
+            <w:r>
+              <w:rPr>
+                <w:b/>
+              </w:rPr>
+              <w:t>自动写入飞书「评论记录」表</w:t>
+            </w:r>
+          </w:p>
+        </w:tc>
+      </w:tr>
+      <w:tr>
+        <w:tc>
+          <w:tcPr>
+            <w:tcW w:type="dxa" w:w="4320"/>
+          </w:tcPr>
+          <w:p>
+            <w:r/>
+            <w:r>
               <w:t>同意并发送</w:t>
             </w:r>
           </w:p>
@@ -1698,7 +1728,16 @@
         <w:t>标准动作</w:t>
       </w:r>
       <w:r>
-        <w:t>：生成草稿 → 读一遍 → 满意就「复制评论」→ 打开 X 找到原帖手动回复 → 回来不用管（或点跳过清理列表）。</w:t>
+        <w:t>：生成草稿 → 读一遍 → 满意就「复制评论」→ 打开 X 找到原帖手动回复 → 回来点「</w:t>
+      </w:r>
+      <w:r>
+        <w:rPr>
+          <w:b/>
+        </w:rPr>
+        <w:t>标记已评论</w:t>
+      </w:r>
+      <w:r>
+        <w:t>」（飞书记录表自动记一行）。</w:t>
       </w:r>
     </w:p>
     <w:p>
@@ -2252,6 +2291,84 @@
           <w:color w:val="808080"/>
           <w:sz w:val="18"/>
         </w:rPr>
+        <w:t>Q：能给一个账号填多个关键词吗？怎么填？</w:t>
+      </w:r>
+    </w:p>
+    <w:p>
+      <w:r>
+        <w:t>能。在「账号」点卡片 →「详情 / 设置」→「关键词」文本框，</w:t>
+      </w:r>
+      <w:r>
+        <w:rPr>
+          <w:b/>
+        </w:rPr>
+        <w:t>每行填一个</w:t>
+      </w:r>
+      <w:r>
+        <w:t>，保存。这是一整个账号的关键词库。（「选题发布」页顶部的"关键词"输入框是另一回事——它只决定</w:t>
+      </w:r>
+      <w:r>
+        <w:rPr>
+          <w:b/>
+        </w:rPr>
+        <w:t>本次归纳</w:t>
+      </w:r>
+      <w:r>
+        <w:t>针对哪个词，不填就归纳该号全部搜索帖。）</w:t>
+      </w:r>
+    </w:p>
+    <w:p>
+      <w:r>
+        <w:rPr>
+          <w:i/>
+          <w:color w:val="808080"/>
+          <w:sz w:val="18"/>
+        </w:rPr>
+        <w:t>Q：填了多个关键词，系统是怎么搜的？一个一个还是同时搜？</w:t>
+      </w:r>
+    </w:p>
+    <w:p>
+      <w:r>
+        <w:rPr>
+          <w:b/>
+        </w:rPr>
+        <w:t>一个一个搜</w:t>
+      </w:r>
+      <w:r>
+        <w:t>。每轮浏览，系统从关键词库取</w:t>
+      </w:r>
+      <w:r>
+        <w:rPr>
+          <w:b/>
+        </w:rPr>
+        <w:t>前 N 个</w:t>
+      </w:r>
+      <w:r>
+        <w:t>（设置里的"每日选取数量"，默认 2 个，可改 1–5），Worker 在同一个浏览器里逐个打开 X 搜索页：搜完第一个词、浏览收集完帖子，再搜第二个。同一时刻一个账号只搜一个词（防 X 风控，不会多开）。想让别的词先被搜到，就把它排到列表前面。</w:t>
+      </w:r>
+    </w:p>
+    <w:p>
+      <w:r>
+        <w:rPr>
+          <w:i/>
+          <w:color w:val="808080"/>
+          <w:sz w:val="18"/>
+        </w:rPr>
+        <w:t>Q：点「生成评论草稿」报 "account not found"？</w:t>
+      </w:r>
+    </w:p>
+    <w:p>
+      <w:r>
+        <w:t>已修复（2026-07-28）。之前是系统内部账号编号没对上，现在正常。再遇到找技术。</w:t>
+      </w:r>
+    </w:p>
+    <w:p>
+      <w:r>
+        <w:rPr>
+          <w:i/>
+          <w:color w:val="808080"/>
+          <w:sz w:val="18"/>
+        </w:rPr>
         <w:t>Q：生成的正文不满意？</w:t>
       </w:r>
     </w:p>

</xml_diff>